<commit_message>
drafts: Flex draft regenerated from the result-first bullet bank
Co-Authored-By: Claude Fable 5.1 <noreply@anthropic.com>
Claude-Session: https://claude.ai/code/session_01WPNZer93LbR2d9qrDdJBQb
</commit_message>
<xml_diff>
--- a/drafts/2026-09-10-flex-product-line-director-dc-power-and-bess-2.docx
+++ b/drafts/2026-09-10-flex-product-line-director-dc-power-and-bess-2.docx
@@ -44,7 +44,7 @@
     </w:p>
     <w:p>
       <w:r>
-        <w:t>Product manager who took LG Energy Solution from battery racks to a prefabricated containerized ESS, partnering with Jabil on the first product. Senior product manager for grid-scale BESS with 8 years in lithium-ion storage, from deal engineering to product line ownership. Licensed Professional Engineer with an MBA in product strategy.</w:t>
+        <w:t>Senior product manager for grid-scale BESS with 8 years in lithium-ion storage, from deal engineering to product line ownership. Product manager who took LG Energy Solution from battery racks to a prefabricated containerized ESS, partnering with Jabil on the first product. Licensed Professional Engineer with an MBA in product strategy.</w:t>
       </w:r>
     </w:p>
     <w:p>
@@ -97,7 +97,7 @@
         <w:pStyle w:val="ListBullet"/>
       </w:pPr>
       <w:r>
-        <w:t>Partnered with Jabil to standardize and prefabricate LG's first modular containerized ESS, replacing bespoke on-site integration by system integrators.</w:t>
+        <w:t>Replaced bespoke on-site integration, the market's biggest pain point, with LG's first prefabricated ESS container, built with Jabil.</w:t>
       </w:r>
     </w:p>
     <w:p>
@@ -105,7 +105,7 @@
         <w:pStyle w:val="ListBullet"/>
       </w:pPr>
       <w:r>
-        <w:t>Designed LG's first pre-integrated 2.86 MWh battery container with Jabil.</w:t>
+        <w:t>Designed the 2.86 MWh pre-integrated container with Jabil, moving LG from selling racks to integrators to selling a finished product.</w:t>
       </w:r>
     </w:p>
     <w:p>
@@ -113,7 +113,7 @@
         <w:pStyle w:val="ListBullet"/>
       </w:pPr>
       <w:r>
-        <w:t>Deployed the standardized container at 584 MWh on Fifth Standard in California and 361 MWh on Bright Arrow in Texas.</w:t>
+        <w:t>Won approval for a 2-hour AC-integrated BESS, against a plan to stay at 4-hour, with a techno-economic business case.</w:t>
       </w:r>
     </w:p>
     <w:p>
@@ -121,7 +121,7 @@
         <w:pStyle w:val="ListBullet"/>
       </w:pPr>
       <w:r>
-        <w:t>Made the case for a 2-hour AC-integrated BESS when LG planned to stay at 4-hour duration.</w:t>
+        <w:t>Turned the 2-hour container into LG's flagship for AI data centers, with about 3 GWh booked for 2027.</w:t>
       </w:r>
     </w:p>
     <w:p>
@@ -129,7 +129,7 @@
         <w:pStyle w:val="ListBullet"/>
       </w:pPr>
       <w:r>
-        <w:t>Led product development (NPI) of the 2-hour container, now LG's flagship for AI data centers, with about 3 GWh booked for 2027.</w:t>
+        <w:t>Opened the AI data center segment for LG's BESS by defining its ride-through, interconnection and bring-your-own-generation feature set.</w:t>
       </w:r>
     </w:p>
     <w:p>
@@ -137,7 +137,7 @@
         <w:pStyle w:val="ListBullet"/>
       </w:pPr>
       <w:r>
-        <w:t>Lead product strategy for grid-scale battery storage sold to hyperscale AI data center customers, including Meta, Google, NVIDIA and Microsoft.</w:t>
+        <w:t>Met UL 9540 on the container by setting fire safety requirements before the industry had settled how to prove them.</w:t>
       </w:r>
     </w:p>
     <w:p>
@@ -145,7 +145,7 @@
         <w:pStyle w:val="ListBullet"/>
       </w:pPr>
       <w:r>
-        <w:t>Set the fire safety requirements for the container while the industry was still defining how to prove them.</w:t>
+        <w:t>Built the cost model from cell cost to system selling price, plus customers' EPC cost, behind the container's pricing.</w:t>
       </w:r>
     </w:p>
     <w:p>
@@ -153,7 +153,7 @@
         <w:pStyle w:val="ListBullet"/>
       </w:pPr>
       <w:r>
-        <w:t>Modeled product cost from cell cost through system selling price, plus customers' EPC and installation cost.</w:t>
+        <w:t>Lead grid-scale BESS product strategy for AI data center customers Meta, Google, NVIDIA and Microsoft.</w:t>
       </w:r>
     </w:p>
     <w:p>
@@ -189,7 +189,7 @@
         <w:pStyle w:val="ListBullet"/>
       </w:pPr>
       <w:r>
-        <w:t>Managed sales, design and project management of commercial and luxury residential HVAC projects from proposal through engineering, construction and startup.</w:t>
+        <w:t>Managed HVAC project sales, design and delivery, exceeding the department's $2M annual sales goal.</w:t>
       </w:r>
     </w:p>
     <w:p>
@@ -197,7 +197,7 @@
         <w:pStyle w:val="ListBullet"/>
       </w:pPr>
       <w:r>
-        <w:t>Exceeded the department's annual project sales goal of $2M.</w:t>
+        <w:t>Designed HVAC and hydronic systems with energy modeling, equipment sizing and duct and piping layouts for commercial and residential projects.</w:t>
       </w:r>
     </w:p>
     <w:p>
@@ -205,7 +205,7 @@
         <w:pStyle w:val="ListBullet"/>
       </w:pPr>
       <w:r>
-        <w:t>Designed HVAC and hydronic systems using building energy modeling, equipment sizing and duct and piping layouts to code.</w:t>
+        <w:t>Set up an OSHA-compliant internal safety program with technician training classes and record-keeping procedures.</w:t>
       </w:r>
     </w:p>
     <w:p>
@@ -241,7 +241,7 @@
         <w:pStyle w:val="ListBullet"/>
       </w:pPr>
       <w:r>
-        <w:t>Developed energy-efficiency and demand-response projects for commercial and industrial customers under statewide incentives, including cogeneration, thermal energy storage and battery peak-shifting.</w:t>
+        <w:t>Generated cumulative savings of 2,500 kW and 7 million kWh, helping the company exceed its energy-savings goal.</w:t>
       </w:r>
     </w:p>
     <w:p>
@@ -249,7 +249,7 @@
         <w:pStyle w:val="ListBullet"/>
       </w:pPr>
       <w:r>
-        <w:t>Generated cumulative savings of 2,500 kW and 7 million kWh, helping the company exceed its energy-savings goal through field audits.</w:t>
+        <w:t>Developed energy-efficiency projects for commercial and industrial customers under statewide efficiency and demand-response incentives, covering chillers, boilers and cooling towers.</w:t>
       </w:r>
     </w:p>
     <w:p>
@@ -280,21 +280,7 @@
         <w:t>MBA Honda IMPACT Project</w:t>
       </w:r>
       <w:r>
-        <w:t>: Built a five-year go-to-market plan for Honda to launch hydrogen fuel cells, electrolyzers and second-life EV batteries into the US C&amp;I market.</w:t>
-      </w:r>
-    </w:p>
-    <w:p>
-      <w:pPr>
-        <w:pStyle w:val="ListBullet"/>
-      </w:pPr>
-      <w:r>
-        <w:rPr>
-          <w:b/>
-        </w:rPr>
-        <w:t>Institutional Research Pulse Bot</w:t>
-      </w:r>
-      <w:r>
-        <w:t>: Shipped a multi-agent system that ingests 100-200 analyst reports daily and delivers a daily Market Pulse research brief to a paying customer.</w:t>
+        <w:t>: Built a five-year go-to-market plan for Honda to launch hydrogen fuel cells, electrolyzers and second-life EV batteries in the US C&amp;I market.</w:t>
       </w:r>
     </w:p>
     <w:p>
@@ -343,7 +329,7 @@
     </w:p>
     <w:p>
       <w:r>
-        <w:t>California Licensed Professional Engineer #M38303, Thermal and Fluid Systems (NCEES, 2016)</w:t>
+        <w:t>California Licensed Professional Engineer #M38303, Thermal and Fluid Systems (NCEES), 2016</w:t>
       </w:r>
     </w:p>
     <w:p>
@@ -369,10 +355,10 @@
           <w:b/>
           <w:color w:val="1B4965"/>
         </w:rPr>
-        <w:t xml:space="preserve">BESS: </w:t>
+        <w:t xml:space="preserve">BESS &amp; Power Systems: </w:t>
       </w:r>
       <w:r>
-        <w:t>power conversion systems (PCS), thermal systems, codes &amp; standards (UL, NFPA), fire safety, testing &amp; certification, lithium-ion system design, BMS</w:t>
+        <w:t>energy storage, BMS, lithium-ion system design, degradation/thermal modeling, augmentation optimization, system sizing, fire safety, codes and standards (UL, NFPA)</w:t>
       </w:r>
     </w:p>
     <w:p>
@@ -381,10 +367,10 @@
           <w:b/>
           <w:color w:val="1B4965"/>
         </w:rPr>
-        <w:t xml:space="preserve">Grid &amp; Utility: </w:t>
+        <w:t xml:space="preserve">Grid &amp; Data Center: </w:t>
       </w:r>
       <w:r>
-        <w:t>interconnection, demand response, energy efficiency, US energy markets (ERCOT), electricity financial contracts (forwards, tolling, swaps)</w:t>
+        <w:t>interconnection, US energy markets (ERCOT), techno-economic analysis, energy efficiency, demand response, electricity financial contracts</w:t>
       </w:r>
     </w:p>
     <w:p>
@@ -396,7 +382,7 @@
         <w:t xml:space="preserve">Product &amp; Commercial: </w:t>
       </w:r>
       <w:r>
-        <w:t>NPI, product strategy, market requirements, competitive analysis, contract negotiation, financial modeling, proposal tendering, VOC, US GAAP</w:t>
+        <w:t>commercialization, product development, NPI, product strategy, market requirements, competitive analysis, financial modeling, contract negotiation</w:t>
       </w:r>
     </w:p>
     <w:p>
@@ -405,10 +391,10 @@
           <w:b/>
           <w:color w:val="1B4965"/>
         </w:rPr>
-        <w:t xml:space="preserve">Software &amp; Analytics: </w:t>
+        <w:t xml:space="preserve">Tools: </w:t>
       </w:r>
       <w:r>
-        <w:t>Python, SQL, Tableau, MATLAB, FastAPI, GitHub Actions, Docker, Anthropic API, MCP</w:t>
+        <w:t>Tableau, Advanced Excel, Salesforce, AutoCAD, MATLAB, Python</w:t>
       </w:r>
     </w:p>
     <w:sectPr>

</xml_diff>

<commit_message>
Experience library: scope bullet goes last; Flex draft regenerated after the dedupe
Co-Authored-By: Claude Fable 5.1 <noreply@anthropic.com>
Claude-Session: https://claude.ai/code/session_01WPNZer93LbR2d9qrDdJBQb
</commit_message>
<xml_diff>
--- a/drafts/2026-09-10-flex-product-line-director-dc-power-and-bess-2.docx
+++ b/drafts/2026-09-10-flex-product-line-director-dc-power-and-bess-2.docx
@@ -44,7 +44,7 @@
     </w:p>
     <w:p>
       <w:r>
-        <w:t>Senior product manager for grid-scale BESS with 8 years in lithium-ion storage, from deal engineering to product line ownership. Product manager who took LG Energy Solution from battery racks to a prefabricated containerized ESS, partnering with Jabil on the first product. Licensed Professional Engineer with an MBA in product strategy.</w:t>
+        <w:t>Senior product manager for grid-scale BESS at LG Energy Solution, with 8 years in lithium-ion storage from deal engineering to product line ownership. Sells to AI data center customers including Meta, Google, NVIDIA and Microsoft, and to front-of-meter grid storage developers. Licensed Professional Engineer with an MBA in product strategy.</w:t>
       </w:r>
     </w:p>
     <w:p>
@@ -97,7 +97,7 @@
         <w:pStyle w:val="ListBullet"/>
       </w:pPr>
       <w:r>
-        <w:t>Replaced bespoke on-site integration, the market's biggest pain point, with LG's first prefabricated ESS container, built with Jabil.</w:t>
+        <w:t>Own new product development for grid-scale ESS, from voice of customer through market requirements.</w:t>
       </w:r>
     </w:p>
     <w:p>
@@ -113,6 +113,14 @@
         <w:pStyle w:val="ListBullet"/>
       </w:pPr>
       <w:r>
+        <w:t>Deployed 584 MWh on Fifth Standard in California and 361 MWh on Bright Arrow in Texas with the standardized container.</w:t>
+      </w:r>
+    </w:p>
+    <w:p>
+      <w:pPr>
+        <w:pStyle w:val="ListBullet"/>
+      </w:pPr>
+      <w:r>
         <w:t>Won approval for a 2-hour AC-integrated BESS, against a plan to stay at 4-hour, with a techno-economic business case.</w:t>
       </w:r>
     </w:p>
@@ -121,7 +129,7 @@
         <w:pStyle w:val="ListBullet"/>
       </w:pPr>
       <w:r>
-        <w:t>Turned the 2-hour container into LG's flagship for AI data centers, with about 3 GWh booked for 2027.</w:t>
+        <w:t>Booked about 3 GWh for 2027 on the 2-hour product, now LG's flagship for AI data centers.</w:t>
       </w:r>
     </w:p>
     <w:p>
@@ -129,7 +137,7 @@
         <w:pStyle w:val="ListBullet"/>
       </w:pPr>
       <w:r>
-        <w:t>Opened the AI data center segment for LG's BESS by defining its ride-through, interconnection and bring-your-own-generation feature set.</w:t>
+        <w:t>Priced feature trade-offs in EPC and installation cost, energy density and shipping weight to set the product requirements.</w:t>
       </w:r>
     </w:p>
     <w:p>
@@ -137,7 +145,7 @@
         <w:pStyle w:val="ListBullet"/>
       </w:pPr>
       <w:r>
-        <w:t>Met UL 9540 on the container by setting fire safety requirements before the industry had settled how to prove them.</w:t>
+        <w:t>Opened the AI infrastructure and data center segment for LG's BESS by defining its ride-through, interconnection and bring-your-own-generation feature set.</w:t>
       </w:r>
     </w:p>
     <w:p>
@@ -145,7 +153,7 @@
         <w:pStyle w:val="ListBullet"/>
       </w:pPr>
       <w:r>
-        <w:t>Built the cost model from cell cost to system selling price, plus customers' EPC cost, behind the container's pricing.</w:t>
+        <w:t>Achieved UL 9540 listing for the container by setting fire safety requirements before the industry had settled how to prove them.</w:t>
       </w:r>
     </w:p>
     <w:p>
@@ -153,7 +161,15 @@
         <w:pStyle w:val="ListBullet"/>
       </w:pPr>
       <w:r>
-        <w:t>Lead grid-scale BESS product strategy for AI data center customers Meta, Google, NVIDIA and Microsoft.</w:t>
+        <w:t>Set the container's selling price and chose its inverter configuration with a cell-to-system cost model that included customers' EPC cost.</w:t>
+      </w:r>
+    </w:p>
+    <w:p>
+      <w:pPr>
+        <w:pStyle w:val="ListBullet"/>
+      </w:pPr>
+      <w:r>
+        <w:t>Cut proposal turnaround from days to hours with battery modeling tools for degradation, thermal and augmentation optimization.</w:t>
       </w:r>
     </w:p>
     <w:p>
@@ -189,23 +205,7 @@
         <w:pStyle w:val="ListBullet"/>
       </w:pPr>
       <w:r>
-        <w:t>Managed HVAC project sales, design and delivery, exceeding the department's $2M annual sales goal.</w:t>
-      </w:r>
-    </w:p>
-    <w:p>
-      <w:pPr>
-        <w:pStyle w:val="ListBullet"/>
-      </w:pPr>
-      <w:r>
-        <w:t>Designed HVAC and hydronic systems with energy modeling, equipment sizing and duct and piping layouts for commercial and residential projects.</w:t>
-      </w:r>
-    </w:p>
-    <w:p>
-      <w:pPr>
-        <w:pStyle w:val="ListBullet"/>
-      </w:pPr>
-      <w:r>
-        <w:t>Set up an OSHA-compliant internal safety program with technician training classes and record-keeping procedures.</w:t>
+        <w:t>Managed HVAC projects from proposal through construction and startup, exceeding the department's $2M annual sales goal.</w:t>
       </w:r>
     </w:p>
     <w:p>
@@ -246,14 +246,6 @@
     </w:p>
     <w:p>
       <w:pPr>
-        <w:pStyle w:val="ListBullet"/>
-      </w:pPr>
-      <w:r>
-        <w:t>Developed energy-efficiency projects for commercial and industrial customers under statewide efficiency and demand-response incentives, covering chillers, boilers and cooling towers.</w:t>
-      </w:r>
-    </w:p>
-    <w:p>
-      <w:pPr>
         <w:spacing w:before="120" w:after="40"/>
         <w:pBdr>
           <w:bottom w:val="single" w:sz="8" w:space="1" w:color="1B4965"/>
@@ -280,7 +272,7 @@
         <w:t>MBA Honda IMPACT Project</w:t>
       </w:r>
       <w:r>
-        <w:t>: Built a five-year go-to-market plan for Honda to launch hydrogen fuel cells, electrolyzers and second-life EV batteries in the US C&amp;I market.</w:t>
+        <w:t>: Built a five-year go-to-market plan for Honda to launch hydrogen fuel cells, electrolyzers and second-life EV batteries into the US C&amp;I market.</w:t>
       </w:r>
     </w:p>
     <w:p>
@@ -329,7 +321,7 @@
     </w:p>
     <w:p>
       <w:r>
-        <w:t>California Licensed Professional Engineer #M38303, Thermal and Fluid Systems (NCEES), 2016</w:t>
+        <w:t>California Licensed Professional Engineer #M38303, Thermal and Fluid Systems (2016, NCEES)</w:t>
       </w:r>
     </w:p>
     <w:p>
@@ -355,10 +347,10 @@
           <w:b/>
           <w:color w:val="1B4965"/>
         </w:rPr>
-        <w:t xml:space="preserve">BESS &amp; Power Systems: </w:t>
+        <w:t xml:space="preserve">BESS &amp; power systems: </w:t>
       </w:r>
       <w:r>
-        <w:t>energy storage, BMS, lithium-ion system design, degradation/thermal modeling, augmentation optimization, system sizing, fire safety, codes and standards (UL, NFPA)</w:t>
+        <w:t>energy storage systems, thermal systems, power conversion systems (PCS), lithium-ion system design, BMS, fire safety, codes &amp; standards (UL, NFPA), techno-economic analysis</w:t>
       </w:r>
     </w:p>
     <w:p>
@@ -367,10 +359,10 @@
           <w:b/>
           <w:color w:val="1B4965"/>
         </w:rPr>
-        <w:t xml:space="preserve">Grid &amp; Data Center: </w:t>
+        <w:t xml:space="preserve">Product &amp; commercial: </w:t>
       </w:r>
       <w:r>
-        <w:t>interconnection, US energy markets (ERCOT), techno-economic analysis, energy efficiency, demand response, electricity financial contracts</w:t>
+        <w:t>product strategy, market requirements, VOC, competitive analysis, proposal tendering, contract negotiation, financial modeling</w:t>
       </w:r>
     </w:p>
     <w:p>
@@ -379,22 +371,10 @@
           <w:b/>
           <w:color w:val="1B4965"/>
         </w:rPr>
-        <w:t xml:space="preserve">Product &amp; Commercial: </w:t>
+        <w:t xml:space="preserve">Grid/utility: </w:t>
       </w:r>
       <w:r>
-        <w:t>commercialization, product development, NPI, product strategy, market requirements, competitive analysis, financial modeling, contract negotiation</w:t>
-      </w:r>
-    </w:p>
-    <w:p>
-      <w:r>
-        <w:rPr>
-          <w:b/>
-          <w:color w:val="1B4965"/>
-        </w:rPr>
-        <w:t xml:space="preserve">Tools: </w:t>
-      </w:r>
-      <w:r>
-        <w:t>Tableau, Advanced Excel, Salesforce, AutoCAD, MATLAB, Python</w:t>
+        <w:t>interconnection, energy efficiency, demand response, US energy markets (ERCOT)</w:t>
       </w:r>
     </w:p>
     <w:sectPr>

</xml_diff>

<commit_message>
drafts: Flex draft with two LG titles under one employer heading
Co-Authored-By: Claude Fable 5.1 <noreply@anthropic.com>
Claude-Session: https://claude.ai/code/session_01WPNZer93LbR2d9qrDdJBQb
</commit_message>
<xml_diff>
--- a/drafts/2026-09-10-flex-product-line-director-dc-power-and-bess-2.docx
+++ b/drafts/2026-09-10-flex-product-line-director-dc-power-and-bess-2.docx
@@ -79,12 +79,6 @@
       </w:r>
       <w:r>
         <w:rPr>
-          <w:color w:val="5B6470"/>
-        </w:rPr>
-        <w:t xml:space="preserve">  |  Senior Product Manager, Grid-Scale BESS</w:t>
-      </w:r>
-      <w:r>
-        <w:rPr>
           <w:i/>
           <w:color w:val="5B6470"/>
         </w:rPr>
@@ -94,10 +88,24 @@
     </w:p>
     <w:p>
       <w:pPr>
-        <w:pStyle w:val="ListBullet"/>
+        <w:tabs>
+          <w:tab w:pos="10512" w:val="right"/>
+        </w:tabs>
+        <w:spacing w:before="40"/>
       </w:pPr>
       <w:r>
-        <w:t>Own new product development for grid-scale ESS, from voice of customer through market requirements.</w:t>
+        <w:rPr>
+          <w:b w:val="0"/>
+        </w:rPr>
+        <w:t>Senior Product Manager, Grid-Scale BESS</w:t>
+      </w:r>
+      <w:r>
+        <w:rPr>
+          <w:i/>
+          <w:color w:val="5B6470"/>
+        </w:rPr>
+        <w:tab/>
+        <w:t>Feb 2021 – present</w:t>
       </w:r>
     </w:p>
     <w:p>
@@ -137,7 +145,7 @@
         <w:pStyle w:val="ListBullet"/>
       </w:pPr>
       <w:r>
-        <w:t>Priced feature trade-offs in EPC and installation cost, energy density and shipping weight to set the product requirements.</w:t>
+        <w:t>Opened the AI data center segment for LG's BESS by defining its ride-through, interconnection and bring-your-own-generation feature set.</w:t>
       </w:r>
     </w:p>
     <w:p>
@@ -145,15 +153,7 @@
         <w:pStyle w:val="ListBullet"/>
       </w:pPr>
       <w:r>
-        <w:t>Opened the AI infrastructure and data center segment for LG's BESS by defining its ride-through, interconnection and bring-your-own-generation feature set.</w:t>
-      </w:r>
-    </w:p>
-    <w:p>
-      <w:pPr>
-        <w:pStyle w:val="ListBullet"/>
-      </w:pPr>
-      <w:r>
-        <w:t>Achieved UL 9540 listing for the container by setting fire safety requirements before the industry had settled how to prove them.</w:t>
+        <w:t>Achieved UL 9540 listing for the container, setting fire safety requirements and running hazard mitigation analysis and deflagration CFD with fire consultants.</w:t>
       </w:r>
     </w:p>
     <w:p>
@@ -166,10 +166,40 @@
     </w:p>
     <w:p>
       <w:pPr>
+        <w:tabs>
+          <w:tab w:pos="10512" w:val="right"/>
+        </w:tabs>
+        <w:spacing w:before="40"/>
+      </w:pPr>
+      <w:r>
+        <w:rPr>
+          <w:b w:val="0"/>
+        </w:rPr>
+        <w:t>Senior Systems Engineer, Energy Storage</w:t>
+      </w:r>
+      <w:r>
+        <w:rPr>
+          <w:i/>
+          <w:color w:val="5B6470"/>
+        </w:rPr>
+        <w:tab/>
+        <w:t>Feb 2018 – Feb 2021</w:t>
+      </w:r>
+    </w:p>
+    <w:p>
+      <w:pPr>
         <w:pStyle w:val="ListBullet"/>
       </w:pPr>
       <w:r>
         <w:t>Cut proposal turnaround from days to hours with battery modeling tools for degradation, thermal and augmentation optimization.</w:t>
+      </w:r>
+    </w:p>
+    <w:p>
+      <w:pPr>
+        <w:pStyle w:val="ListBullet"/>
+      </w:pPr>
+      <w:r>
+        <w:t>Sized lithium-ion systems for North American deals and negotiated their technical exhibits and bid clarifications with utilities and developers.</w:t>
       </w:r>
     </w:p>
     <w:p>
@@ -205,7 +235,7 @@
         <w:pStyle w:val="ListBullet"/>
       </w:pPr>
       <w:r>
-        <w:t>Managed HVAC projects from proposal through construction and startup, exceeding the department's $2M annual sales goal.</w:t>
+        <w:t>Managed sales, design and project management of commercial and luxury residential HVAC projects, exceeding the department's annual project sales goal of $2M.</w:t>
       </w:r>
     </w:p>
     <w:p>
@@ -246,6 +276,14 @@
     </w:p>
     <w:p>
       <w:pPr>
+        <w:pStyle w:val="ListBullet"/>
+      </w:pPr>
+      <w:r>
+        <w:t>Developed energy-efficiency projects for commercial and industrial customers under statewide efficiency and demand-response incentives, including cogeneration, thermal energy storage and battery peak-shifting.</w:t>
+      </w:r>
+    </w:p>
+    <w:p>
+      <w:pPr>
         <w:spacing w:before="120" w:after="40"/>
         <w:pBdr>
           <w:bottom w:val="single" w:sz="8" w:space="1" w:color="1B4965"/>
@@ -272,7 +310,7 @@
         <w:t>MBA Honda IMPACT Project</w:t>
       </w:r>
       <w:r>
-        <w:t>: Built a five-year go-to-market plan for Honda to launch hydrogen fuel cells, electrolyzers and second-life EV batteries into the US C&amp;I market.</w:t>
+        <w:t>: Built a five-year business plan for Honda to launch hydrogen fuel cells, electrolyzers and second-life EV batteries into the US C&amp;I market.</w:t>
       </w:r>
     </w:p>
     <w:p>
@@ -299,7 +337,7 @@
     </w:p>
     <w:p>
       <w:r>
-        <w:t>BS Mechanical Engineering, UC Davis, 2013, Dean's Honor List</w:t>
+        <w:t>BS Mechanical Engineering, UC Davis, 2013</w:t>
       </w:r>
     </w:p>
     <w:p>
@@ -321,7 +359,7 @@
     </w:p>
     <w:p>
       <w:r>
-        <w:t>California Licensed Professional Engineer #M38303, Thermal and Fluid Systems (2016, NCEES)</w:t>
+        <w:t>California Licensed Professional Engineer #M38303, Thermal and Fluid Systems (NCEES, 2016)</w:t>
       </w:r>
     </w:p>
     <w:p>
@@ -347,10 +385,10 @@
           <w:b/>
           <w:color w:val="1B4965"/>
         </w:rPr>
-        <w:t xml:space="preserve">BESS &amp; power systems: </w:t>
+        <w:t xml:space="preserve">BESS: </w:t>
       </w:r>
       <w:r>
-        <w:t>energy storage systems, thermal systems, power conversion systems (PCS), lithium-ion system design, BMS, fire safety, codes &amp; standards (UL, NFPA), techno-economic analysis</w:t>
+        <w:t>power conversion systems (PCS), BMS, fire safety, codes &amp; standards (UL, NFPA), testing &amp; certification, lithium-ion system design, degradation/thermal modeling, techno-economic analysis</w:t>
       </w:r>
     </w:p>
     <w:p>
@@ -362,7 +400,7 @@
         <w:t xml:space="preserve">Product &amp; commercial: </w:t>
       </w:r>
       <w:r>
-        <w:t>product strategy, market requirements, VOC, competitive analysis, proposal tendering, contract negotiation, financial modeling</w:t>
+        <w:t>product development, NPI, product strategy, market requirements, competitive analysis, contract negotiation, financial modeling, proposal tendering</w:t>
       </w:r>
     </w:p>
     <w:p>
@@ -374,7 +412,7 @@
         <w:t xml:space="preserve">Grid/utility: </w:t>
       </w:r>
       <w:r>
-        <w:t>interconnection, energy efficiency, demand response, US energy markets (ERCOT)</w:t>
+        <w:t>power systems, interconnection, demand response, US energy markets (ERCOT), energy efficiency, electricity financial contracts (forwards, tolling, swaps)</w:t>
       </w:r>
     </w:p>
     <w:sectPr>

</xml_diff>